<commit_message>
Total général préféré au sous-total dans le rattachement des sources ; résultats sans LLM après les corrections A/B ; exemples régénérés
Co-Authored-By: Claude Opus 5.5 <noreply@anthropic.com>
Claude-Session: https://claude.ai/code/session_013JXMEQCNGgRjDzvz3X6fC9
</commit_message>
<xml_diff>
--- a/data/outputs/note_analyse_chapitre_PME_2024.docx
+++ b/data/outputs/note_analyse_chapitre_PME_2024.docx
@@ -964,7 +964,7 @@
           <w:color w:val="595959"/>
           <w:sz w:val="16"/>
         </w:rPr>
-        <w:t>Sources : variation calculée (var_rel_pct) : Yaoundé / Total, valeurs n° 10476 et n° 10475 (réf. 2023)</w:t>
+        <w:t>Sources : variation calculée (var_rel_pct) : Total / Total, valeurs n° 10808 et n° 10807 (réf. 2023)</w:t>
       </w:r>
     </w:p>
     <w:p>
@@ -1083,7 +1083,7 @@
           <w:color w:val="595959"/>
           <w:sz w:val="16"/>
         </w:rPr>
-        <w:t>Sources : variation calculée (var_rel_pct) : Yaoundé / Total, valeurs n° 10834 et n° 10833 (réf. 2023)</w:t>
+        <w:t>Sources : variation calculée (var_rel_pct) : Total / Total, valeurs n° 11110 et n° 11109 (réf. 2023)</w:t>
       </w:r>
     </w:p>
     <w:p>
@@ -1202,7 +1202,7 @@
           <w:color w:val="595959"/>
           <w:sz w:val="16"/>
         </w:rPr>
-        <w:t>Sources : variation calculée (var_rel_pct) : Yaoundé / Total, valeurs n° 11144 et n° 11143 (réf. 2023)</w:t>
+        <w:t>Sources : variation calculée (var_rel_pct) : Total / Total, valeurs n° 11466 et n° 11465 (réf. 2023)</w:t>
       </w:r>
     </w:p>
     <w:p>
@@ -1321,7 +1321,7 @@
           <w:color w:val="595959"/>
           <w:sz w:val="16"/>
         </w:rPr>
-        <w:t>Sources : variation calculée (var_rel_pct) : Yaoundé / Total, valeurs n° 11490 et n° 11489 (réf. 2023)</w:t>
+        <w:t>Sources : variation calculée (var_rel_pct) : Total / Total, valeurs n° 11739 et n° 11738 (réf. 2023)</w:t>
       </w:r>
     </w:p>
     <w:p>

</xml_diff>